<commit_message>
feat: finalize SIPANTES Play Store release
</commit_message>
<xml_diff>
--- a/docs/Modul_RSUD_Otista_Mobile_API_dan_Pengujian.docx
+++ b/docs/Modul_RSUD_Otista_Mobile_API_dan_Pengujian.docx
@@ -23,7 +23,16 @@
         <w:rPr>
           <w:b/>
         </w:rPr>
-        <w:t xml:space="preserve">RSUD Otista Mobile</w:t>
+        <w:t xml:space="preserve">SIPANTES</w:t>
+      </w:r>
+    </w:p>
+    <w:p>
+      <w:pPr>
+        <w:jc w:val="center"/>
+      </w:pPr>
+      <w:r>
+        <w:rPr/>
+        <w:t xml:space="preserve">Sistem Pendaftaran Terintegrasi RSUD Oto Iskandar Di Nata</w:t>
       </w:r>
     </w:p>
     <w:p>
@@ -291,7 +300,7 @@
             <w:pPr/>
             <w:r>
               <w:rPr/>
-              <w:t xml:space="preserve">id.go.bandungkab.rsudotista.mobile · 1.0.0 (versionCode 1)</w:t>
+              <w:t xml:space="preserve">id.rsudotista.sipantes · 1.0.0 (versionCode 1)</w:t>
             </w:r>
           </w:p>
         </w:tc>

</xml_diff>